<commit_message>
SOP MoveMonitor (19b) en Orthotimer (25b): passage Vooraf over de juiste deelnemer en het juiste toestel
Zoals hoofdstuk 3 van de SOP Novel pedar: de deelnemerscode uit REDCap als enige sleutel, de koppeling met de persoon
alleen op eCRF 00, het toestelnummer op eCRF 20/27 en het sensornummer op eCRF 25/33, met een controle en een let op.
In alle twaalf kopieen; figuur 1 van de Orthotimer blijft bij haar onderschrift.

Co-Authored-By: Claude Opus 5.5 <noreply@anthropic.com>
</commit_message>
<xml_diff>
--- a/(e)CRF/Per nummer/19b_Werkinstructie MoveMonitor (SOP Dynaport).docx
+++ b/(e)CRF/Per nummer/19b_Werkinstructie MoveMonitor (SOP Dynaport).docx
@@ -272,6 +272,95 @@
           <w:color w:val="24303B"/>
         </w:rPr>
         <w:tab/>
+      </w:r>
+    </w:p>
+    <w:p>
+      <w:pPr>
+        <w:keepNext/>
+        <w:spacing w:before="200"/>
+      </w:pPr>
+      <w:r>
+        <w:rPr>
+          <w:b/>
+          <w:color w:val="123A5F"/>
+          <w:sz w:val="24"/>
+          <w:lang w:val="nl-BE"/>
+        </w:rPr>
+        <w:t xml:space="preserve">Vooraf: de juiste deelnemer en het juiste toestel</w:t>
+      </w:r>
+    </w:p>
+    <w:p>
+      <w:r>
+        <w:rPr>
+          <w:lang w:val="nl-BE"/>
+        </w:rPr>
+        <w:t xml:space="preserve">Alles hangt aan de deelnemerscode die REDCap toekent: dezelfde code staat op elk papieren formulier van deze deelnemer en is uniek over alle centra. Een naam, rijksregisternummer of echte geboortedatum komt nergens in de software; de koppeling tussen code en persoon staat alleen op de patiëntenidentificatielijst (eCRF 00) in je centrum.</w:t>
+      </w:r>
+    </w:p>
+    <w:p>
+      <w:r>
+        <w:rPr>
+          <w:lang w:val="nl-BE"/>
+        </w:rPr>
+        <w:t xml:space="preserve">In het portaal van McRoberts vul je bij Subject code de letter M in, gevolgd door de deelnemerscode, en bij Year of Birth 1900, voor iedereen dezelfde. Gewicht, lengte en geslacht neem je over van de deelnemer.</w:t>
+      </w:r>
+    </w:p>
+    <w:p>
+      <w:r>
+        <w:rPr>
+          <w:lang w:val="nl-BE"/>
+        </w:rPr>
+        <w:t xml:space="preserve">Elk centrum heeft vier MoveMonitors, die van deelnemer wisselen. Noteer daarom bij het meegeven het referentienummer van het toestel op eCRF 20, en bij de teruggave hetzelfde nummer op eCRF 27.</w:t>
+      </w:r>
+    </w:p>
+    <w:p>
+      <w:pPr>
+        <w:pBdr>
+          <w:left w:val="single" w:sz="18" w:space="8" w:color="123A5F"/>
+        </w:pBdr>
+        <w:spacing w:before="120" w:after="120"/>
+        <w:ind w:left="425"/>
+      </w:pPr>
+      <w:r>
+        <w:rPr>
+          <w:b/>
+          <w:color w:val="123A5F"/>
+          <w:sz w:val="20"/>
+          <w:lang w:val="nl-BE"/>
+        </w:rPr>
+        <w:t xml:space="preserve">■ CONTROLEER  </w:t>
+      </w:r>
+      <w:r>
+        <w:rPr>
+          <w:b/>
+          <w:lang w:val="nl-BE"/>
+        </w:rPr>
+        <w:t xml:space="preserve">Vóór Start Measurement: de Subject code op het scherm is M met de deelnemerscode van eCRF 20, en het nummer op het toestel is het referentienummer op eCRF 20.</w:t>
+      </w:r>
+    </w:p>
+    <w:p>
+      <w:pPr>
+        <w:pBdr>
+          <w:left w:val="single" w:sz="18" w:space="8" w:color="B3261E"/>
+        </w:pBdr>
+        <w:spacing w:before="120" w:after="120"/>
+        <w:ind w:left="425"/>
+      </w:pPr>
+      <w:r>
+        <w:rPr>
+          <w:b/>
+          <w:color w:val="B3261E"/>
+          <w:sz w:val="20"/>
+          <w:lang w:val="nl-BE"/>
+        </w:rPr>
+        <w:t xml:space="preserve">▲ LET OP  </w:t>
+      </w:r>
+      <w:r>
+        <w:rPr>
+          <w:b/>
+          <w:lang w:val="nl-BE"/>
+        </w:rPr>
+        <w:t xml:space="preserve">Een verkeerde Subject code of een verwisseld toestel hangt de hele meetweek aan de verkeerde deelnemer, en daarmee diens waaktijd en draagnorm.</w:t>
       </w:r>
     </w:p>
     <w:p>

</xml_diff>